<commit_message>
Semana 9: actividad autónoma de front (talleres, inscripción y perfil)
Guía paso a paso (.md y .docx) para programar /talleres, /talleres/[id]
y /perfil consumiendo backend-memoria, un backend listo que no necesita
base de datos. Incluye los archivos base con TODO, capturas de referencia
y cómo se evalúa.

Co-Authored-By: Claude Opus 5.5 <noreply@anthropic.com>
</commit_message>
<xml_diff>
--- a/parcial-2-bd-supabase-auth/semana-09/README.docx
+++ b/parcial-2-bd-supabase-auth/semana-09/README.docx
@@ -9,6 +9,39 @@
       </w:pPr>
       <w:r>
         <w:t xml:space="preserve">Semana 9 (19-23 oct) — Programación Web</w:t>
+      </w:r>
+    </w:p>
+    <w:p>
+      <w:pPr>
+        <w:pStyle w:val="BlockText"/>
+      </w:pPr>
+      <w:r>
+        <w:rPr>
+          <w:b/>
+          <w:bCs/>
+        </w:rPr>
+        <w:t xml:space="preserve">Esta semana (19-23 oct) trabajas con la actividad autónoma:</w:t>
+      </w:r>
+      <w:r>
+        <w:t xml:space="preserve"> </w:t>
+      </w:r>
+      <w:r>
+        <w:t xml:space="preserve">sigue</w:t>
+      </w:r>
+      <w:r>
+        <w:t xml:space="preserve"> </w:t>
+      </w:r>
+      <w:r>
+        <w:rPr>
+          <w:rStyle w:val="VerbatimChar"/>
+        </w:rPr>
+        <w:t xml:space="preserve">actividad-autonoma-front/GUIA-PASO-A-PASO.md</w:t>
+      </w:r>
+      <w:r>
+        <w:t xml:space="preserve"> </w:t>
+      </w:r>
+      <w:r>
+        <w:t xml:space="preserve">(también en .docx). Vas a programar en tu mini-proyecto las páginas de talleres, inscripción y perfil contra un backend ya hecho. Lo de abajo (CRUD de usuarios + Supabase) se trabaja cuando regrese tu docente.</w:t>
       </w:r>
     </w:p>
     <w:p>

</xml_diff>